<commit_message>
classes + constructors + fields
</commit_message>
<xml_diff>
--- a/30-Day_Java_Python_CSharp_ClaudeCode_Checklist.docx
+++ b/30-Day_Java_Python_CSharp_ClaudeCode_Checklist.docx
@@ -4613,6 +4613,18 @@
           <w:szCs w:val="28"/>
           <w:lang w:val="en-GB"/>
         </w:rPr>
+        <w:t>/</w:t>
+      </w:r>
+      <w:r>
+        <w:rPr>
+          <w:rFonts w:ascii="Segoe UI Symbol" w:eastAsiaTheme="majorEastAsia" w:hAnsi="Segoe UI Symbol" w:cs="Segoe UI Symbol"/>
+          <w:b/>
+          <w:bCs/>
+          <w:color w:val="365F91" w:themeColor="accent1" w:themeShade="BF"/>
+          <w:sz w:val="28"/>
+          <w:szCs w:val="28"/>
+          <w:lang w:val="en-GB"/>
+        </w:rPr>
         <w:t>☐</w:t>
       </w:r>
       <w:r>
@@ -4650,6 +4662,18 @@
           <w:szCs w:val="28"/>
           <w:lang w:val="en-GB"/>
         </w:rPr>
+        <w:t>/</w:t>
+      </w:r>
+      <w:r>
+        <w:rPr>
+          <w:rFonts w:ascii="Segoe UI Symbol" w:eastAsiaTheme="majorEastAsia" w:hAnsi="Segoe UI Symbol" w:cs="Segoe UI Symbol"/>
+          <w:b/>
+          <w:bCs/>
+          <w:color w:val="365F91" w:themeColor="accent1" w:themeShade="BF"/>
+          <w:sz w:val="28"/>
+          <w:szCs w:val="28"/>
+          <w:lang w:val="en-GB"/>
+        </w:rPr>
         <w:t>☐</w:t>
       </w:r>
       <w:r>
@@ -4687,6 +4711,18 @@
           <w:szCs w:val="28"/>
           <w:lang w:val="en-GB"/>
         </w:rPr>
+        <w:t>/</w:t>
+      </w:r>
+      <w:r>
+        <w:rPr>
+          <w:rFonts w:ascii="Segoe UI Symbol" w:eastAsiaTheme="majorEastAsia" w:hAnsi="Segoe UI Symbol" w:cs="Segoe UI Symbol"/>
+          <w:b/>
+          <w:bCs/>
+          <w:color w:val="365F91" w:themeColor="accent1" w:themeShade="BF"/>
+          <w:sz w:val="28"/>
+          <w:szCs w:val="28"/>
+          <w:lang w:val="en-GB"/>
+        </w:rPr>
         <w:t>☐</w:t>
       </w:r>
       <w:r>
@@ -4724,6 +4760,18 @@
           <w:szCs w:val="28"/>
           <w:lang w:val="en-GB"/>
         </w:rPr>
+        <w:t>/</w:t>
+      </w:r>
+      <w:r>
+        <w:rPr>
+          <w:rFonts w:ascii="Segoe UI Symbol" w:eastAsiaTheme="majorEastAsia" w:hAnsi="Segoe UI Symbol" w:cs="Segoe UI Symbol"/>
+          <w:b/>
+          <w:bCs/>
+          <w:color w:val="365F91" w:themeColor="accent1" w:themeShade="BF"/>
+          <w:sz w:val="28"/>
+          <w:szCs w:val="28"/>
+          <w:lang w:val="en-GB"/>
+        </w:rPr>
         <w:t>☐</w:t>
       </w:r>
       <w:r>
@@ -4786,6 +4834,18 @@
           <w:szCs w:val="28"/>
           <w:lang w:val="en-GB"/>
         </w:rPr>
+        <w:t>/</w:t>
+      </w:r>
+      <w:r>
+        <w:rPr>
+          <w:rFonts w:ascii="Segoe UI Symbol" w:eastAsiaTheme="majorEastAsia" w:hAnsi="Segoe UI Symbol" w:cs="Segoe UI Symbol"/>
+          <w:b/>
+          <w:bCs/>
+          <w:color w:val="365F91" w:themeColor="accent1" w:themeShade="BF"/>
+          <w:sz w:val="28"/>
+          <w:szCs w:val="28"/>
+          <w:lang w:val="en-GB"/>
+        </w:rPr>
         <w:t>☐</w:t>
       </w:r>
       <w:r>
@@ -4823,6 +4883,18 @@
           <w:szCs w:val="28"/>
           <w:lang w:val="en-GB"/>
         </w:rPr>
+        <w:t>/</w:t>
+      </w:r>
+      <w:r>
+        <w:rPr>
+          <w:rFonts w:ascii="Segoe UI Symbol" w:eastAsiaTheme="majorEastAsia" w:hAnsi="Segoe UI Symbol" w:cs="Segoe UI Symbol"/>
+          <w:b/>
+          <w:bCs/>
+          <w:color w:val="365F91" w:themeColor="accent1" w:themeShade="BF"/>
+          <w:sz w:val="28"/>
+          <w:szCs w:val="28"/>
+          <w:lang w:val="en-GB"/>
+        </w:rPr>
         <w:t>☐</w:t>
       </w:r>
       <w:r>
@@ -4850,6 +4922,18 @@
           <w:lang w:val="en-GB"/>
         </w:rPr>
       </w:pPr>
+      <w:r>
+        <w:rPr>
+          <w:rFonts w:ascii="Segoe UI Symbol" w:eastAsiaTheme="majorEastAsia" w:hAnsi="Segoe UI Symbol" w:cs="Segoe UI Symbol"/>
+          <w:b/>
+          <w:bCs/>
+          <w:color w:val="365F91" w:themeColor="accent1" w:themeShade="BF"/>
+          <w:sz w:val="28"/>
+          <w:szCs w:val="28"/>
+          <w:lang w:val="en-GB"/>
+        </w:rPr>
+        <w:t>/</w:t>
+      </w:r>
       <w:r>
         <w:rPr>
           <w:rFonts w:ascii="Segoe UI Symbol" w:eastAsiaTheme="majorEastAsia" w:hAnsi="Segoe UI Symbol" w:cs="Segoe UI Symbol"/>
@@ -4923,6 +5007,18 @@
           <w:szCs w:val="28"/>
           <w:lang w:val="en-GB"/>
         </w:rPr>
+        <w:t>/</w:t>
+      </w:r>
+      <w:r>
+        <w:rPr>
+          <w:rFonts w:ascii="Segoe UI Symbol" w:eastAsiaTheme="majorEastAsia" w:hAnsi="Segoe UI Symbol" w:cs="Segoe UI Symbol"/>
+          <w:b/>
+          <w:bCs/>
+          <w:color w:val="365F91" w:themeColor="accent1" w:themeShade="BF"/>
+          <w:sz w:val="28"/>
+          <w:szCs w:val="28"/>
+          <w:lang w:val="en-GB"/>
+        </w:rPr>
         <w:t>☐</w:t>
       </w:r>
       <w:r>
@@ -4960,6 +5056,18 @@
           <w:szCs w:val="28"/>
           <w:lang w:val="en-GB"/>
         </w:rPr>
+        <w:t>/</w:t>
+      </w:r>
+      <w:r>
+        <w:rPr>
+          <w:rFonts w:ascii="Segoe UI Symbol" w:eastAsiaTheme="majorEastAsia" w:hAnsi="Segoe UI Symbol" w:cs="Segoe UI Symbol"/>
+          <w:b/>
+          <w:bCs/>
+          <w:color w:val="365F91" w:themeColor="accent1" w:themeShade="BF"/>
+          <w:sz w:val="28"/>
+          <w:szCs w:val="28"/>
+          <w:lang w:val="en-GB"/>
+        </w:rPr>
         <w:t>☐</w:t>
       </w:r>
       <w:r>
@@ -4987,6 +5095,18 @@
           <w:lang w:val="en-GB"/>
         </w:rPr>
       </w:pPr>
+      <w:r>
+        <w:rPr>
+          <w:rFonts w:ascii="Segoe UI Symbol" w:eastAsiaTheme="majorEastAsia" w:hAnsi="Segoe UI Symbol" w:cs="Segoe UI Symbol"/>
+          <w:b/>
+          <w:bCs/>
+          <w:color w:val="365F91" w:themeColor="accent1" w:themeShade="BF"/>
+          <w:sz w:val="28"/>
+          <w:szCs w:val="28"/>
+          <w:lang w:val="en-GB"/>
+        </w:rPr>
+        <w:t>/</w:t>
+      </w:r>
       <w:r>
         <w:rPr>
           <w:rFonts w:ascii="Segoe UI Symbol" w:eastAsiaTheme="majorEastAsia" w:hAnsi="Segoe UI Symbol" w:cs="Segoe UI Symbol"/>

</xml_diff>

<commit_message>
rewrite progress from memory
</commit_message>
<xml_diff>
--- a/30-Day_Java_Python_CSharp_ClaudeCode_Checklist.docx
+++ b/30-Day_Java_Python_CSharp_ClaudeCode_Checklist.docx
@@ -5179,6 +5179,18 @@
           <w:szCs w:val="28"/>
           <w:lang w:val="en-GB"/>
         </w:rPr>
+        <w:t>/</w:t>
+      </w:r>
+      <w:r>
+        <w:rPr>
+          <w:rFonts w:ascii="Segoe UI Symbol" w:eastAsiaTheme="majorEastAsia" w:hAnsi="Segoe UI Symbol" w:cs="Segoe UI Symbol"/>
+          <w:b/>
+          <w:bCs/>
+          <w:color w:val="365F91" w:themeColor="accent1" w:themeShade="BF"/>
+          <w:sz w:val="28"/>
+          <w:szCs w:val="28"/>
+          <w:lang w:val="en-GB"/>
+        </w:rPr>
         <w:t>☐</w:t>
       </w:r>
       <w:r>
@@ -5231,6 +5243,18 @@
           <w:lang w:val="en-GB"/>
         </w:rPr>
       </w:pPr>
+      <w:r>
+        <w:rPr>
+          <w:rFonts w:ascii="Segoe UI Symbol" w:eastAsiaTheme="majorEastAsia" w:hAnsi="Segoe UI Symbol" w:cs="Segoe UI Symbol"/>
+          <w:b/>
+          <w:bCs/>
+          <w:color w:val="365F91" w:themeColor="accent1" w:themeShade="BF"/>
+          <w:sz w:val="28"/>
+          <w:szCs w:val="28"/>
+          <w:lang w:val="en-GB"/>
+        </w:rPr>
+        <w:t>/</w:t>
+      </w:r>
       <w:r>
         <w:rPr>
           <w:rFonts w:ascii="Segoe UI Symbol" w:eastAsiaTheme="majorEastAsia" w:hAnsi="Segoe UI Symbol" w:cs="Segoe UI Symbol"/>
@@ -5355,6 +5379,18 @@
           <w:szCs w:val="28"/>
           <w:lang w:val="en-GB"/>
         </w:rPr>
+        <w:t>/</w:t>
+      </w:r>
+      <w:r>
+        <w:rPr>
+          <w:rFonts w:ascii="Segoe UI Symbol" w:eastAsiaTheme="majorEastAsia" w:hAnsi="Segoe UI Symbol" w:cs="Segoe UI Symbol"/>
+          <w:b/>
+          <w:bCs/>
+          <w:color w:val="365F91" w:themeColor="accent1" w:themeShade="BF"/>
+          <w:sz w:val="28"/>
+          <w:szCs w:val="28"/>
+          <w:lang w:val="en-GB"/>
+        </w:rPr>
         <w:t>☐</w:t>
       </w:r>
       <w:r>
@@ -5417,6 +5453,18 @@
           <w:szCs w:val="28"/>
           <w:lang w:val="en-GB"/>
         </w:rPr>
+        <w:t>/</w:t>
+      </w:r>
+      <w:r>
+        <w:rPr>
+          <w:rFonts w:ascii="Segoe UI Symbol" w:eastAsiaTheme="majorEastAsia" w:hAnsi="Segoe UI Symbol" w:cs="Segoe UI Symbol"/>
+          <w:b/>
+          <w:bCs/>
+          <w:color w:val="365F91" w:themeColor="accent1" w:themeShade="BF"/>
+          <w:sz w:val="28"/>
+          <w:szCs w:val="28"/>
+          <w:lang w:val="en-GB"/>
+        </w:rPr>
         <w:t>☐</w:t>
       </w:r>
       <w:r>
@@ -5479,6 +5527,18 @@
           <w:szCs w:val="28"/>
           <w:lang w:val="en-GB"/>
         </w:rPr>
+        <w:t>/</w:t>
+      </w:r>
+      <w:r>
+        <w:rPr>
+          <w:rFonts w:ascii="Segoe UI Symbol" w:eastAsiaTheme="majorEastAsia" w:hAnsi="Segoe UI Symbol" w:cs="Segoe UI Symbol"/>
+          <w:b/>
+          <w:bCs/>
+          <w:color w:val="365F91" w:themeColor="accent1" w:themeShade="BF"/>
+          <w:sz w:val="28"/>
+          <w:szCs w:val="28"/>
+          <w:lang w:val="en-GB"/>
+        </w:rPr>
         <w:t>☐</w:t>
       </w:r>
       <w:r>
@@ -5541,6 +5601,18 @@
           <w:szCs w:val="28"/>
           <w:lang w:val="en-GB"/>
         </w:rPr>
+        <w:t>/</w:t>
+      </w:r>
+      <w:r>
+        <w:rPr>
+          <w:rFonts w:ascii="Segoe UI Symbol" w:eastAsiaTheme="majorEastAsia" w:hAnsi="Segoe UI Symbol" w:cs="Segoe UI Symbol"/>
+          <w:b/>
+          <w:bCs/>
+          <w:color w:val="365F91" w:themeColor="accent1" w:themeShade="BF"/>
+          <w:sz w:val="28"/>
+          <w:szCs w:val="28"/>
+          <w:lang w:val="en-GB"/>
+        </w:rPr>
         <w:t>☐</w:t>
       </w:r>
       <w:r>
@@ -5578,6 +5650,18 @@
           <w:szCs w:val="28"/>
           <w:lang w:val="en-GB"/>
         </w:rPr>
+        <w:t>/</w:t>
+      </w:r>
+      <w:r>
+        <w:rPr>
+          <w:rFonts w:ascii="Segoe UI Symbol" w:eastAsiaTheme="majorEastAsia" w:hAnsi="Segoe UI Symbol" w:cs="Segoe UI Symbol"/>
+          <w:b/>
+          <w:bCs/>
+          <w:color w:val="365F91" w:themeColor="accent1" w:themeShade="BF"/>
+          <w:sz w:val="28"/>
+          <w:szCs w:val="28"/>
+          <w:lang w:val="en-GB"/>
+        </w:rPr>
         <w:t>☐</w:t>
       </w:r>
       <w:r>
@@ -5640,6 +5724,18 @@
           <w:szCs w:val="28"/>
           <w:lang w:val="en-GB"/>
         </w:rPr>
+        <w:t>/</w:t>
+      </w:r>
+      <w:r>
+        <w:rPr>
+          <w:rFonts w:ascii="Segoe UI Symbol" w:eastAsiaTheme="majorEastAsia" w:hAnsi="Segoe UI Symbol" w:cs="Segoe UI Symbol"/>
+          <w:b/>
+          <w:bCs/>
+          <w:color w:val="365F91" w:themeColor="accent1" w:themeShade="BF"/>
+          <w:sz w:val="28"/>
+          <w:szCs w:val="28"/>
+          <w:lang w:val="en-GB"/>
+        </w:rPr>
         <w:t>☐</w:t>
       </w:r>
       <w:r>
@@ -5678,6 +5774,18 @@
           <w:lang w:val="en-GB"/>
         </w:rPr>
         <w:lastRenderedPageBreak/>
+        <w:t>/</w:t>
+      </w:r>
+      <w:r>
+        <w:rPr>
+          <w:rFonts w:ascii="Segoe UI Symbol" w:eastAsiaTheme="majorEastAsia" w:hAnsi="Segoe UI Symbol" w:cs="Segoe UI Symbol"/>
+          <w:b/>
+          <w:bCs/>
+          <w:color w:val="365F91" w:themeColor="accent1" w:themeShade="BF"/>
+          <w:sz w:val="28"/>
+          <w:szCs w:val="28"/>
+          <w:lang w:val="en-GB"/>
+        </w:rPr>
         <w:t>☐</w:t>
       </w:r>
       <w:r>
@@ -5705,6 +5813,18 @@
           <w:lang w:val="en-GB"/>
         </w:rPr>
       </w:pPr>
+      <w:r>
+        <w:rPr>
+          <w:rFonts w:ascii="Segoe UI Symbol" w:eastAsiaTheme="majorEastAsia" w:hAnsi="Segoe UI Symbol" w:cs="Segoe UI Symbol"/>
+          <w:b/>
+          <w:bCs/>
+          <w:color w:val="365F91" w:themeColor="accent1" w:themeShade="BF"/>
+          <w:sz w:val="28"/>
+          <w:szCs w:val="28"/>
+          <w:lang w:val="en-GB"/>
+        </w:rPr>
+        <w:t>/</w:t>
+      </w:r>
       <w:r>
         <w:rPr>
           <w:rFonts w:ascii="Segoe UI Symbol" w:eastAsiaTheme="majorEastAsia" w:hAnsi="Segoe UI Symbol" w:cs="Segoe UI Symbol"/>

</xml_diff>

<commit_message>
rebuilt all prjects + encapsulation + accessmodifiers
</commit_message>
<xml_diff>
--- a/30-Day_Java_Python_CSharp_ClaudeCode_Checklist.docx
+++ b/30-Day_Java_Python_CSharp_ClaudeCode_Checklist.docx
@@ -5949,6 +5949,18 @@
           <w:szCs w:val="28"/>
           <w:lang w:val="en-GB"/>
         </w:rPr>
+        <w:t>/</w:t>
+      </w:r>
+      <w:r>
+        <w:rPr>
+          <w:rFonts w:ascii="Segoe UI Symbol" w:eastAsiaTheme="majorEastAsia" w:hAnsi="Segoe UI Symbol" w:cs="Segoe UI Symbol"/>
+          <w:b/>
+          <w:bCs/>
+          <w:color w:val="365F91" w:themeColor="accent1" w:themeShade="BF"/>
+          <w:sz w:val="28"/>
+          <w:szCs w:val="28"/>
+          <w:lang w:val="en-GB"/>
+        </w:rPr>
         <w:t>☐</w:t>
       </w:r>
       <w:r>
@@ -5986,6 +5998,18 @@
           <w:szCs w:val="28"/>
           <w:lang w:val="en-GB"/>
         </w:rPr>
+        <w:t>/</w:t>
+      </w:r>
+      <w:r>
+        <w:rPr>
+          <w:rFonts w:ascii="Segoe UI Symbol" w:eastAsiaTheme="majorEastAsia" w:hAnsi="Segoe UI Symbol" w:cs="Segoe UI Symbol"/>
+          <w:b/>
+          <w:bCs/>
+          <w:color w:val="365F91" w:themeColor="accent1" w:themeShade="BF"/>
+          <w:sz w:val="28"/>
+          <w:szCs w:val="28"/>
+          <w:lang w:val="en-GB"/>
+        </w:rPr>
         <w:t>☐</w:t>
       </w:r>
       <w:r>
@@ -6023,6 +6047,18 @@
           <w:szCs w:val="28"/>
           <w:lang w:val="en-GB"/>
         </w:rPr>
+        <w:t>/</w:t>
+      </w:r>
+      <w:r>
+        <w:rPr>
+          <w:rFonts w:ascii="Segoe UI Symbol" w:eastAsiaTheme="majorEastAsia" w:hAnsi="Segoe UI Symbol" w:cs="Segoe UI Symbol"/>
+          <w:b/>
+          <w:bCs/>
+          <w:color w:val="365F91" w:themeColor="accent1" w:themeShade="BF"/>
+          <w:sz w:val="28"/>
+          <w:szCs w:val="28"/>
+          <w:lang w:val="en-GB"/>
+        </w:rPr>
         <w:t>☐</w:t>
       </w:r>
       <w:r>
@@ -6060,6 +6096,18 @@
           <w:szCs w:val="28"/>
           <w:lang w:val="en-GB"/>
         </w:rPr>
+        <w:t>/</w:t>
+      </w:r>
+      <w:r>
+        <w:rPr>
+          <w:rFonts w:ascii="Segoe UI Symbol" w:eastAsiaTheme="majorEastAsia" w:hAnsi="Segoe UI Symbol" w:cs="Segoe UI Symbol"/>
+          <w:b/>
+          <w:bCs/>
+          <w:color w:val="365F91" w:themeColor="accent1" w:themeShade="BF"/>
+          <w:sz w:val="28"/>
+          <w:szCs w:val="28"/>
+          <w:lang w:val="en-GB"/>
+        </w:rPr>
         <w:t>☐</w:t>
       </w:r>
       <w:r>
@@ -6087,6 +6135,18 @@
           <w:lang w:val="en-GB"/>
         </w:rPr>
       </w:pPr>
+      <w:r>
+        <w:rPr>
+          <w:rFonts w:ascii="Segoe UI Symbol" w:eastAsiaTheme="majorEastAsia" w:hAnsi="Segoe UI Symbol" w:cs="Segoe UI Symbol"/>
+          <w:b/>
+          <w:bCs/>
+          <w:color w:val="365F91" w:themeColor="accent1" w:themeShade="BF"/>
+          <w:sz w:val="28"/>
+          <w:szCs w:val="28"/>
+          <w:lang w:val="en-GB"/>
+        </w:rPr>
+        <w:t>/</w:t>
+      </w:r>
       <w:r>
         <w:rPr>
           <w:rFonts w:ascii="Segoe UI Symbol" w:eastAsiaTheme="majorEastAsia" w:hAnsi="Segoe UI Symbol" w:cs="Segoe UI Symbol"/>
@@ -6186,6 +6246,18 @@
           <w:szCs w:val="28"/>
           <w:lang w:val="en-GB"/>
         </w:rPr>
+        <w:t>/</w:t>
+      </w:r>
+      <w:r>
+        <w:rPr>
+          <w:rFonts w:ascii="Segoe UI Symbol" w:eastAsiaTheme="majorEastAsia" w:hAnsi="Segoe UI Symbol" w:cs="Segoe UI Symbol"/>
+          <w:b/>
+          <w:bCs/>
+          <w:color w:val="365F91" w:themeColor="accent1" w:themeShade="BF"/>
+          <w:sz w:val="28"/>
+          <w:szCs w:val="28"/>
+          <w:lang w:val="en-GB"/>
+        </w:rPr>
         <w:t>☐</w:t>
       </w:r>
       <w:r>
@@ -6223,6 +6295,18 @@
           <w:szCs w:val="28"/>
           <w:lang w:val="en-GB"/>
         </w:rPr>
+        <w:t>/</w:t>
+      </w:r>
+      <w:r>
+        <w:rPr>
+          <w:rFonts w:ascii="Segoe UI Symbol" w:eastAsiaTheme="majorEastAsia" w:hAnsi="Segoe UI Symbol" w:cs="Segoe UI Symbol"/>
+          <w:b/>
+          <w:bCs/>
+          <w:color w:val="365F91" w:themeColor="accent1" w:themeShade="BF"/>
+          <w:sz w:val="28"/>
+          <w:szCs w:val="28"/>
+          <w:lang w:val="en-GB"/>
+        </w:rPr>
         <w:t>☐</w:t>
       </w:r>
       <w:r>
@@ -6260,6 +6344,18 @@
           <w:szCs w:val="28"/>
           <w:lang w:val="en-GB"/>
         </w:rPr>
+        <w:t>/</w:t>
+      </w:r>
+      <w:r>
+        <w:rPr>
+          <w:rFonts w:ascii="Segoe UI Symbol" w:eastAsiaTheme="majorEastAsia" w:hAnsi="Segoe UI Symbol" w:cs="Segoe UI Symbol"/>
+          <w:b/>
+          <w:bCs/>
+          <w:color w:val="365F91" w:themeColor="accent1" w:themeShade="BF"/>
+          <w:sz w:val="28"/>
+          <w:szCs w:val="28"/>
+          <w:lang w:val="en-GB"/>
+        </w:rPr>
         <w:t>☐</w:t>
       </w:r>
       <w:r>
@@ -6297,6 +6393,18 @@
           <w:szCs w:val="28"/>
           <w:lang w:val="en-GB"/>
         </w:rPr>
+        <w:t>/</w:t>
+      </w:r>
+      <w:r>
+        <w:rPr>
+          <w:rFonts w:ascii="Segoe UI Symbol" w:eastAsiaTheme="majorEastAsia" w:hAnsi="Segoe UI Symbol" w:cs="Segoe UI Symbol"/>
+          <w:b/>
+          <w:bCs/>
+          <w:color w:val="365F91" w:themeColor="accent1" w:themeShade="BF"/>
+          <w:sz w:val="28"/>
+          <w:szCs w:val="28"/>
+          <w:lang w:val="en-GB"/>
+        </w:rPr>
         <w:t>☐</w:t>
       </w:r>
       <w:r>
@@ -6324,6 +6432,18 @@
           <w:lang w:val="en-GB"/>
         </w:rPr>
       </w:pPr>
+      <w:r>
+        <w:rPr>
+          <w:rFonts w:ascii="Segoe UI Symbol" w:eastAsiaTheme="majorEastAsia" w:hAnsi="Segoe UI Symbol" w:cs="Segoe UI Symbol"/>
+          <w:b/>
+          <w:bCs/>
+          <w:color w:val="365F91" w:themeColor="accent1" w:themeShade="BF"/>
+          <w:sz w:val="28"/>
+          <w:szCs w:val="28"/>
+          <w:lang w:val="en-GB"/>
+        </w:rPr>
+        <w:t>/</w:t>
+      </w:r>
       <w:r>
         <w:rPr>
           <w:rFonts w:ascii="Segoe UI Symbol" w:eastAsiaTheme="majorEastAsia" w:hAnsi="Segoe UI Symbol" w:cs="Segoe UI Symbol"/>

</xml_diff>

<commit_message>
exceptions + custom exceptions
</commit_message>
<xml_diff>
--- a/30-Day_Java_Python_CSharp_ClaudeCode_Checklist.docx
+++ b/30-Day_Java_Python_CSharp_ClaudeCode_Checklist.docx
@@ -6543,6 +6543,18 @@
           <w:szCs w:val="28"/>
           <w:lang w:val="en-GB"/>
         </w:rPr>
+        <w:t>/</w:t>
+      </w:r>
+      <w:r>
+        <w:rPr>
+          <w:rFonts w:ascii="Segoe UI Symbol" w:eastAsiaTheme="majorEastAsia" w:hAnsi="Segoe UI Symbol" w:cs="Segoe UI Symbol"/>
+          <w:b/>
+          <w:bCs/>
+          <w:color w:val="365F91" w:themeColor="accent1" w:themeShade="BF"/>
+          <w:sz w:val="28"/>
+          <w:szCs w:val="28"/>
+          <w:lang w:val="en-GB"/>
+        </w:rPr>
         <w:t>☐</w:t>
       </w:r>
       <w:r>
@@ -6580,6 +6592,18 @@
           <w:szCs w:val="28"/>
           <w:lang w:val="en-GB"/>
         </w:rPr>
+        <w:t>/</w:t>
+      </w:r>
+      <w:r>
+        <w:rPr>
+          <w:rFonts w:ascii="Segoe UI Symbol" w:eastAsiaTheme="majorEastAsia" w:hAnsi="Segoe UI Symbol" w:cs="Segoe UI Symbol"/>
+          <w:b/>
+          <w:bCs/>
+          <w:color w:val="365F91" w:themeColor="accent1" w:themeShade="BF"/>
+          <w:sz w:val="28"/>
+          <w:szCs w:val="28"/>
+          <w:lang w:val="en-GB"/>
+        </w:rPr>
         <w:t>☐</w:t>
       </w:r>
       <w:r>
@@ -6618,6 +6642,18 @@
           <w:lang w:val="en-GB"/>
         </w:rPr>
         <w:lastRenderedPageBreak/>
+        <w:t>/</w:t>
+      </w:r>
+      <w:r>
+        <w:rPr>
+          <w:rFonts w:ascii="Segoe UI Symbol" w:eastAsiaTheme="majorEastAsia" w:hAnsi="Segoe UI Symbol" w:cs="Segoe UI Symbol"/>
+          <w:b/>
+          <w:bCs/>
+          <w:color w:val="365F91" w:themeColor="accent1" w:themeShade="BF"/>
+          <w:sz w:val="28"/>
+          <w:szCs w:val="28"/>
+          <w:lang w:val="en-GB"/>
+        </w:rPr>
         <w:t>☐</w:t>
       </w:r>
       <w:r>
@@ -6655,6 +6691,18 @@
           <w:szCs w:val="28"/>
           <w:lang w:val="en-GB"/>
         </w:rPr>
+        <w:t>/</w:t>
+      </w:r>
+      <w:r>
+        <w:rPr>
+          <w:rFonts w:ascii="Segoe UI Symbol" w:eastAsiaTheme="majorEastAsia" w:hAnsi="Segoe UI Symbol" w:cs="Segoe UI Symbol"/>
+          <w:b/>
+          <w:bCs/>
+          <w:color w:val="365F91" w:themeColor="accent1" w:themeShade="BF"/>
+          <w:sz w:val="28"/>
+          <w:szCs w:val="28"/>
+          <w:lang w:val="en-GB"/>
+        </w:rPr>
         <w:t>☐</w:t>
       </w:r>
       <w:r>
@@ -6682,6 +6730,18 @@
           <w:lang w:val="en-GB"/>
         </w:rPr>
       </w:pPr>
+      <w:r>
+        <w:rPr>
+          <w:rFonts w:ascii="Segoe UI Symbol" w:eastAsiaTheme="majorEastAsia" w:hAnsi="Segoe UI Symbol" w:cs="Segoe UI Symbol"/>
+          <w:b/>
+          <w:bCs/>
+          <w:color w:val="365F91" w:themeColor="accent1" w:themeShade="BF"/>
+          <w:sz w:val="28"/>
+          <w:szCs w:val="28"/>
+          <w:lang w:val="en-GB"/>
+        </w:rPr>
+        <w:t>/</w:t>
+      </w:r>
       <w:r>
         <w:rPr>
           <w:rFonts w:ascii="Segoe UI Symbol" w:eastAsiaTheme="majorEastAsia" w:hAnsi="Segoe UI Symbol" w:cs="Segoe UI Symbol"/>

</xml_diff>

<commit_message>
hashmaps + sets + dict + queues
</commit_message>
<xml_diff>
--- a/30-Day_Java_Python_CSharp_ClaudeCode_Checklist.docx
+++ b/30-Day_Java_Python_CSharp_ClaudeCode_Checklist.docx
@@ -6841,6 +6841,18 @@
           <w:szCs w:val="28"/>
           <w:lang w:val="en-GB"/>
         </w:rPr>
+        <w:t>/</w:t>
+      </w:r>
+      <w:r>
+        <w:rPr>
+          <w:rFonts w:ascii="Segoe UI Symbol" w:eastAsiaTheme="majorEastAsia" w:hAnsi="Segoe UI Symbol" w:cs="Segoe UI Symbol"/>
+          <w:b/>
+          <w:bCs/>
+          <w:color w:val="365F91" w:themeColor="accent1" w:themeShade="BF"/>
+          <w:sz w:val="28"/>
+          <w:szCs w:val="28"/>
+          <w:lang w:val="en-GB"/>
+        </w:rPr>
         <w:t>☐</w:t>
       </w:r>
       <w:r>
@@ -6878,6 +6890,18 @@
           <w:szCs w:val="28"/>
           <w:lang w:val="en-GB"/>
         </w:rPr>
+        <w:t>/</w:t>
+      </w:r>
+      <w:r>
+        <w:rPr>
+          <w:rFonts w:ascii="Segoe UI Symbol" w:eastAsiaTheme="majorEastAsia" w:hAnsi="Segoe UI Symbol" w:cs="Segoe UI Symbol"/>
+          <w:b/>
+          <w:bCs/>
+          <w:color w:val="365F91" w:themeColor="accent1" w:themeShade="BF"/>
+          <w:sz w:val="28"/>
+          <w:szCs w:val="28"/>
+          <w:lang w:val="en-GB"/>
+        </w:rPr>
         <w:t>☐</w:t>
       </w:r>
       <w:r>
@@ -6915,6 +6939,18 @@
           <w:szCs w:val="28"/>
           <w:lang w:val="en-GB"/>
         </w:rPr>
+        <w:t>/</w:t>
+      </w:r>
+      <w:r>
+        <w:rPr>
+          <w:rFonts w:ascii="Segoe UI Symbol" w:eastAsiaTheme="majorEastAsia" w:hAnsi="Segoe UI Symbol" w:cs="Segoe UI Symbol"/>
+          <w:b/>
+          <w:bCs/>
+          <w:color w:val="365F91" w:themeColor="accent1" w:themeShade="BF"/>
+          <w:sz w:val="28"/>
+          <w:szCs w:val="28"/>
+          <w:lang w:val="en-GB"/>
+        </w:rPr>
         <w:t>☐</w:t>
       </w:r>
       <w:r>
@@ -6952,6 +6988,18 @@
           <w:szCs w:val="28"/>
           <w:lang w:val="en-GB"/>
         </w:rPr>
+        <w:t>/</w:t>
+      </w:r>
+      <w:r>
+        <w:rPr>
+          <w:rFonts w:ascii="Segoe UI Symbol" w:eastAsiaTheme="majorEastAsia" w:hAnsi="Segoe UI Symbol" w:cs="Segoe UI Symbol"/>
+          <w:b/>
+          <w:bCs/>
+          <w:color w:val="365F91" w:themeColor="accent1" w:themeShade="BF"/>
+          <w:sz w:val="28"/>
+          <w:szCs w:val="28"/>
+          <w:lang w:val="en-GB"/>
+        </w:rPr>
         <w:t>☐</w:t>
       </w:r>
       <w:r>
@@ -6989,6 +7037,18 @@
           <w:szCs w:val="28"/>
           <w:lang w:val="en-GB"/>
         </w:rPr>
+        <w:t>/</w:t>
+      </w:r>
+      <w:r>
+        <w:rPr>
+          <w:rFonts w:ascii="Segoe UI Symbol" w:eastAsiaTheme="majorEastAsia" w:hAnsi="Segoe UI Symbol" w:cs="Segoe UI Symbol"/>
+          <w:b/>
+          <w:bCs/>
+          <w:color w:val="365F91" w:themeColor="accent1" w:themeShade="BF"/>
+          <w:sz w:val="28"/>
+          <w:szCs w:val="28"/>
+          <w:lang w:val="en-GB"/>
+        </w:rPr>
         <w:t>☐</w:t>
       </w:r>
       <w:r>
@@ -7026,6 +7086,18 @@
           <w:szCs w:val="28"/>
           <w:lang w:val="en-GB"/>
         </w:rPr>
+        <w:t>/</w:t>
+      </w:r>
+      <w:r>
+        <w:rPr>
+          <w:rFonts w:ascii="Segoe UI Symbol" w:eastAsiaTheme="majorEastAsia" w:hAnsi="Segoe UI Symbol" w:cs="Segoe UI Symbol"/>
+          <w:b/>
+          <w:bCs/>
+          <w:color w:val="365F91" w:themeColor="accent1" w:themeShade="BF"/>
+          <w:sz w:val="28"/>
+          <w:szCs w:val="28"/>
+          <w:lang w:val="en-GB"/>
+        </w:rPr>
         <w:t>☐</w:t>
       </w:r>
       <w:r>
@@ -7063,6 +7135,18 @@
           <w:szCs w:val="28"/>
           <w:lang w:val="en-GB"/>
         </w:rPr>
+        <w:t>/</w:t>
+      </w:r>
+      <w:r>
+        <w:rPr>
+          <w:rFonts w:ascii="Segoe UI Symbol" w:eastAsiaTheme="majorEastAsia" w:hAnsi="Segoe UI Symbol" w:cs="Segoe UI Symbol"/>
+          <w:b/>
+          <w:bCs/>
+          <w:color w:val="365F91" w:themeColor="accent1" w:themeShade="BF"/>
+          <w:sz w:val="28"/>
+          <w:szCs w:val="28"/>
+          <w:lang w:val="en-GB"/>
+        </w:rPr>
         <w:t>☐</w:t>
       </w:r>
       <w:r>
@@ -7090,6 +7174,18 @@
           <w:lang w:val="en-GB"/>
         </w:rPr>
       </w:pPr>
+      <w:r>
+        <w:rPr>
+          <w:rFonts w:ascii="Segoe UI Symbol" w:eastAsiaTheme="majorEastAsia" w:hAnsi="Segoe UI Symbol" w:cs="Segoe UI Symbol"/>
+          <w:b/>
+          <w:bCs/>
+          <w:color w:val="365F91" w:themeColor="accent1" w:themeShade="BF"/>
+          <w:sz w:val="28"/>
+          <w:szCs w:val="28"/>
+          <w:lang w:val="en-GB"/>
+        </w:rPr>
+        <w:t>/</w:t>
+      </w:r>
       <w:r>
         <w:rPr>
           <w:rFonts w:ascii="Segoe UI Symbol" w:eastAsiaTheme="majorEastAsia" w:hAnsi="Segoe UI Symbol" w:cs="Segoe UI Symbol"/>

</xml_diff>